<commit_message>
adding cr016 implementation report
</commit_message>
<xml_diff>
--- a/docs/08_change_management/CR-004/04_Implementation_Report_CR-004.docx
+++ b/docs/08_change_management/CR-004/04_Implementation_Report_CR-004.docx
@@ -189,7 +189,7 @@
                 <w:rFonts w:ascii="Calibri" w:hAnsi="Calibri"/>
                 <w:sz w:val="22"/>
               </w:rPr>
-              <w:t>[Student Name]</w:t>
+              <w:t>MH Anush</w:t>
             </w:r>
           </w:p>
         </w:tc>
@@ -225,7 +225,7 @@
                 <w:rFonts w:ascii="Calibri" w:hAnsi="Calibri"/>
                 <w:sz w:val="22"/>
               </w:rPr>
-              <w:t>[Student ID]</w:t>
+              <w:t>JFICT2416</w:t>
             </w:r>
           </w:p>
         </w:tc>
@@ -352,8 +352,17 @@
           <w:b/>
           <w:sz w:val="36"/>
         </w:rPr>
-        <w:t>1.2 Existing Behaviour</w:t>
+        <w:t xml:space="preserve">1.2 Existing </w:t>
       </w:r>
+      <w:proofErr w:type="spellStart"/>
+      <w:r>
+        <w:rPr>
+          <w:b/>
+          <w:sz w:val="36"/>
+        </w:rPr>
+        <w:t>Behaviour</w:t>
+      </w:r>
+      <w:proofErr w:type="spellEnd"/>
     </w:p>
     <w:p>
       <w:pPr>
@@ -403,7 +412,23 @@
           <w:rFonts w:ascii="Courier New" w:hAnsi="Courier New"/>
           <w:sz w:val="20"/>
         </w:rPr>
-        <w:t>POST /api/students/</w:t>
+        <w:t>POST /</w:t>
+      </w:r>
+      <w:proofErr w:type="spellStart"/>
+      <w:r>
+        <w:rPr>
+          <w:rFonts w:ascii="Courier New" w:hAnsi="Courier New"/>
+          <w:sz w:val="20"/>
+        </w:rPr>
+        <w:t>api</w:t>
+      </w:r>
+      <w:proofErr w:type="spellEnd"/>
+      <w:r>
+        <w:rPr>
+          <w:rFonts w:ascii="Courier New" w:hAnsi="Courier New"/>
+          <w:sz w:val="20"/>
+        </w:rPr>
+        <w:t>/students/</w:t>
       </w:r>
       <w:r>
         <w:t xml:space="preserve"> and </w:t>
@@ -413,7 +438,23 @@
           <w:rFonts w:ascii="Courier New" w:hAnsi="Courier New"/>
           <w:sz w:val="20"/>
         </w:rPr>
-        <w:t>PUT /api/students/:id</w:t>
+        <w:t>PUT /</w:t>
+      </w:r>
+      <w:proofErr w:type="spellStart"/>
+      <w:r>
+        <w:rPr>
+          <w:rFonts w:ascii="Courier New" w:hAnsi="Courier New"/>
+          <w:sz w:val="20"/>
+        </w:rPr>
+        <w:t>api</w:t>
+      </w:r>
+      <w:proofErr w:type="spellEnd"/>
+      <w:r>
+        <w:rPr>
+          <w:rFonts w:ascii="Courier New" w:hAnsi="Courier New"/>
+          <w:sz w:val="20"/>
+        </w:rPr>
+        <w:t>/students/:id</w:t>
       </w:r>
       <w:r>
         <w:t xml:space="preserve"> accepted unvalidated payloads directly into database queries.</w:t>
@@ -436,6 +477,7 @@
       <w:r>
         <w:t xml:space="preserve">Existing Edit and Delete operations used </w:t>
       </w:r>
+      <w:proofErr w:type="spellStart"/>
       <w:r>
         <w:rPr>
           <w:rFonts w:ascii="Courier New" w:hAnsi="Courier New"/>
@@ -443,6 +485,7 @@
         </w:rPr>
         <w:t>student_id</w:t>
       </w:r>
+      <w:proofErr w:type="spellEnd"/>
       <w:r>
         <w:t>.</w:t>
       </w:r>
@@ -587,7 +630,23 @@
         <w:spacing w:after="80"/>
       </w:pPr>
       <w:r>
-        <w:t>The CR-004 requirements were implemented across both the backend and frontend of the Student Management System. A dedicated validation utility was introduced in the backend to validate all student attributes and enforce format and security constraints. Server-side validation was integrated into both addStudent and editStudent controller handlers, ensuring that requests bypassing the client interface are immediately rejected with HTTP 400 Bad Request and structured error messages.</w:t>
+        <w:t xml:space="preserve">The CR-004 requirements were implemented across both the backend and frontend of the Student Management System. A dedicated validation utility was introduced in the backend to validate all student attributes and enforce format and security constraints. Server-side validation was integrated into both </w:t>
+      </w:r>
+      <w:proofErr w:type="spellStart"/>
+      <w:r>
+        <w:t>addStudent</w:t>
+      </w:r>
+      <w:proofErr w:type="spellEnd"/>
+      <w:r>
+        <w:t xml:space="preserve"> and </w:t>
+      </w:r>
+      <w:proofErr w:type="spellStart"/>
+      <w:r>
+        <w:t>editStudent</w:t>
+      </w:r>
+      <w:proofErr w:type="spellEnd"/>
+      <w:r>
+        <w:t xml:space="preserve"> controller handlers, ensuring that requests bypassing the client interface are immediately rejected with HTTP 400 Bad Request and structured error messages.</w:t>
       </w:r>
     </w:p>
     <w:p>
@@ -595,7 +654,15 @@
         <w:spacing w:after="80"/>
       </w:pPr>
       <w:r>
-        <w:t>On the frontend, real-time client-side validation was implemented in StudentFormModal.jsx. Each field validates on user blur and input change, displaying clear inline error messages beneath affected inputs. Password policy validation is dynamically enforced during student creation and safely bypassed during student updates. Existing CRUD operations, database schema, and administrator authorization remain fully preserved.</w:t>
+        <w:t xml:space="preserve">On the frontend, real-time client-side validation was implemented in </w:t>
+      </w:r>
+      <w:proofErr w:type="spellStart"/>
+      <w:r>
+        <w:t>StudentFormModal.jsx</w:t>
+      </w:r>
+      <w:proofErr w:type="spellEnd"/>
+      <w:r>
+        <w:t>. Each field validates on user blur and input change, displaying clear inline error messages beneath affected inputs. Password policy validation is dynamically enforced during student creation and safely bypassed during student updates. Existing CRUD operations, database schema, and administrator authorization remain fully preserved.</w:t>
       </w:r>
     </w:p>
     <w:p>
@@ -692,7 +759,23 @@
                 <w:rFonts w:ascii="Calibri" w:hAnsi="Calibri"/>
                 <w:sz w:val="22"/>
               </w:rPr>
-              <w:t>backend/src/utils/validation.js</w:t>
+              <w:t>backend/</w:t>
+            </w:r>
+            <w:proofErr w:type="spellStart"/>
+            <w:r>
+              <w:rPr>
+                <w:rFonts w:ascii="Calibri" w:hAnsi="Calibri"/>
+                <w:sz w:val="22"/>
+              </w:rPr>
+              <w:t>src</w:t>
+            </w:r>
+            <w:proofErr w:type="spellEnd"/>
+            <w:r>
+              <w:rPr>
+                <w:rFonts w:ascii="Calibri" w:hAnsi="Calibri"/>
+                <w:sz w:val="22"/>
+              </w:rPr>
+              <w:t>/utils/validation.js</w:t>
             </w:r>
           </w:p>
         </w:tc>
@@ -721,12 +804,37 @@
             <w:pPr>
               <w:spacing w:before="40" w:after="40"/>
             </w:pPr>
-            <w:r>
-              <w:rPr>
-                <w:rFonts w:ascii="Calibri" w:hAnsi="Calibri"/>
-                <w:sz w:val="22"/>
-              </w:rPr>
-              <w:t>Centralised validation utility with individual field validators and validateStudentData()</w:t>
+            <w:proofErr w:type="spellStart"/>
+            <w:r>
+              <w:rPr>
+                <w:rFonts w:ascii="Calibri" w:hAnsi="Calibri"/>
+                <w:sz w:val="22"/>
+              </w:rPr>
+              <w:t>Centralised</w:t>
+            </w:r>
+            <w:proofErr w:type="spellEnd"/>
+            <w:r>
+              <w:rPr>
+                <w:rFonts w:ascii="Calibri" w:hAnsi="Calibri"/>
+                <w:sz w:val="22"/>
+              </w:rPr>
+              <w:t xml:space="preserve"> validation utility with individual field validators and </w:t>
+            </w:r>
+            <w:proofErr w:type="spellStart"/>
+            <w:r>
+              <w:rPr>
+                <w:rFonts w:ascii="Calibri" w:hAnsi="Calibri"/>
+                <w:sz w:val="22"/>
+              </w:rPr>
+              <w:t>validateStudentData</w:t>
+            </w:r>
+            <w:proofErr w:type="spellEnd"/>
+            <w:r>
+              <w:rPr>
+                <w:rFonts w:ascii="Calibri" w:hAnsi="Calibri"/>
+                <w:sz w:val="22"/>
+              </w:rPr>
+              <w:t>()</w:t>
             </w:r>
           </w:p>
         </w:tc>
@@ -745,7 +853,23 @@
                 <w:rFonts w:ascii="Calibri" w:hAnsi="Calibri"/>
                 <w:sz w:val="22"/>
               </w:rPr>
-              <w:t>backend/src/controllers/studentController.js</w:t>
+              <w:t>backend/</w:t>
+            </w:r>
+            <w:proofErr w:type="spellStart"/>
+            <w:r>
+              <w:rPr>
+                <w:rFonts w:ascii="Calibri" w:hAnsi="Calibri"/>
+                <w:sz w:val="22"/>
+              </w:rPr>
+              <w:t>src</w:t>
+            </w:r>
+            <w:proofErr w:type="spellEnd"/>
+            <w:r>
+              <w:rPr>
+                <w:rFonts w:ascii="Calibri" w:hAnsi="Calibri"/>
+                <w:sz w:val="22"/>
+              </w:rPr>
+              <w:t>/controllers/studentController.js</w:t>
             </w:r>
           </w:p>
         </w:tc>
@@ -779,8 +903,65 @@
                 <w:rFonts w:ascii="Calibri" w:hAnsi="Calibri"/>
                 <w:sz w:val="22"/>
               </w:rPr>
-              <w:t>Integrated validateStudentData() into addStudent and editStudent; added ER_DUP_ENTRY handling in editStudent</w:t>
-            </w:r>
+              <w:t xml:space="preserve">Integrated </w:t>
+            </w:r>
+            <w:proofErr w:type="spellStart"/>
+            <w:r>
+              <w:rPr>
+                <w:rFonts w:ascii="Calibri" w:hAnsi="Calibri"/>
+                <w:sz w:val="22"/>
+              </w:rPr>
+              <w:t>validateStudentData</w:t>
+            </w:r>
+            <w:proofErr w:type="spellEnd"/>
+            <w:r>
+              <w:rPr>
+                <w:rFonts w:ascii="Calibri" w:hAnsi="Calibri"/>
+                <w:sz w:val="22"/>
+              </w:rPr>
+              <w:t xml:space="preserve">() into </w:t>
+            </w:r>
+            <w:proofErr w:type="spellStart"/>
+            <w:r>
+              <w:rPr>
+                <w:rFonts w:ascii="Calibri" w:hAnsi="Calibri"/>
+                <w:sz w:val="22"/>
+              </w:rPr>
+              <w:t>addStudent</w:t>
+            </w:r>
+            <w:proofErr w:type="spellEnd"/>
+            <w:r>
+              <w:rPr>
+                <w:rFonts w:ascii="Calibri" w:hAnsi="Calibri"/>
+                <w:sz w:val="22"/>
+              </w:rPr>
+              <w:t xml:space="preserve"> and </w:t>
+            </w:r>
+            <w:proofErr w:type="spellStart"/>
+            <w:r>
+              <w:rPr>
+                <w:rFonts w:ascii="Calibri" w:hAnsi="Calibri"/>
+                <w:sz w:val="22"/>
+              </w:rPr>
+              <w:t>editStudent</w:t>
+            </w:r>
+            <w:proofErr w:type="spellEnd"/>
+            <w:r>
+              <w:rPr>
+                <w:rFonts w:ascii="Calibri" w:hAnsi="Calibri"/>
+                <w:sz w:val="22"/>
+              </w:rPr>
+              <w:t xml:space="preserve">; added ER_DUP_ENTRY handling in </w:t>
+            </w:r>
+            <w:proofErr w:type="spellStart"/>
+            <w:r>
+              <w:rPr>
+                <w:rFonts w:ascii="Calibri" w:hAnsi="Calibri"/>
+                <w:sz w:val="22"/>
+              </w:rPr>
+              <w:t>editStudent</w:t>
+            </w:r>
+            <w:proofErr w:type="spellEnd"/>
           </w:p>
         </w:tc>
       </w:tr>
@@ -798,8 +979,33 @@
                 <w:rFonts w:ascii="Calibri" w:hAnsi="Calibri"/>
                 <w:sz w:val="22"/>
               </w:rPr>
-              <w:t>frontend/src/components/StudentFormModal.jsx</w:t>
-            </w:r>
+              <w:t>frontend/</w:t>
+            </w:r>
+            <w:proofErr w:type="spellStart"/>
+            <w:r>
+              <w:rPr>
+                <w:rFonts w:ascii="Calibri" w:hAnsi="Calibri"/>
+                <w:sz w:val="22"/>
+              </w:rPr>
+              <w:t>src</w:t>
+            </w:r>
+            <w:proofErr w:type="spellEnd"/>
+            <w:r>
+              <w:rPr>
+                <w:rFonts w:ascii="Calibri" w:hAnsi="Calibri"/>
+                <w:sz w:val="22"/>
+              </w:rPr>
+              <w:t>/components/</w:t>
+            </w:r>
+            <w:proofErr w:type="spellStart"/>
+            <w:r>
+              <w:rPr>
+                <w:rFonts w:ascii="Calibri" w:hAnsi="Calibri"/>
+                <w:sz w:val="22"/>
+              </w:rPr>
+              <w:t>StudentFormModal.jsx</w:t>
+            </w:r>
+            <w:proofErr w:type="spellEnd"/>
           </w:p>
         </w:tc>
         <w:tc>
@@ -832,7 +1038,23 @@
                 <w:rFonts w:ascii="Calibri" w:hAnsi="Calibri"/>
                 <w:sz w:val="22"/>
               </w:rPr>
-              <w:t>Implemented client-side field validation, inline error state (fieldErrors, touched), blur handlers, and password strength checks</w:t>
+              <w:t>Implemented client-side field validation, inline error state (</w:t>
+            </w:r>
+            <w:proofErr w:type="spellStart"/>
+            <w:r>
+              <w:rPr>
+                <w:rFonts w:ascii="Calibri" w:hAnsi="Calibri"/>
+                <w:sz w:val="22"/>
+              </w:rPr>
+              <w:t>fieldErrors</w:t>
+            </w:r>
+            <w:proofErr w:type="spellEnd"/>
+            <w:r>
+              <w:rPr>
+                <w:rFonts w:ascii="Calibri" w:hAnsi="Calibri"/>
+                <w:sz w:val="22"/>
+              </w:rPr>
+              <w:t>, touched), blur handlers, and password strength checks</w:t>
             </w:r>
           </w:p>
         </w:tc>
@@ -851,7 +1073,23 @@
                 <w:rFonts w:ascii="Calibri" w:hAnsi="Calibri"/>
                 <w:sz w:val="22"/>
               </w:rPr>
-              <w:t>frontend/src/styles/dashboard.css</w:t>
+              <w:t>frontend/</w:t>
+            </w:r>
+            <w:proofErr w:type="spellStart"/>
+            <w:r>
+              <w:rPr>
+                <w:rFonts w:ascii="Calibri" w:hAnsi="Calibri"/>
+                <w:sz w:val="22"/>
+              </w:rPr>
+              <w:t>src</w:t>
+            </w:r>
+            <w:proofErr w:type="spellEnd"/>
+            <w:r>
+              <w:rPr>
+                <w:rFonts w:ascii="Calibri" w:hAnsi="Calibri"/>
+                <w:sz w:val="22"/>
+              </w:rPr>
+              <w:t>/styles/dashboard.css</w:t>
             </w:r>
           </w:p>
         </w:tc>
@@ -947,25 +1185,59 @@
           <w:rFonts w:ascii="Courier New" w:hAnsi="Courier New"/>
           <w:sz w:val="20"/>
         </w:rPr>
-        <w:t>backend/src/utils/validation.js</w:t>
+        <w:t>backend/</w:t>
       </w:r>
-      <w:r>
-        <w:t xml:space="preserve"> providing dedicated validator functions for registration number, first name, last name, email, phone number, and password, as well as a composite </w:t>
-      </w:r>
+      <w:proofErr w:type="spellStart"/>
       <w:r>
         <w:rPr>
           <w:rFonts w:ascii="Courier New" w:hAnsi="Courier New"/>
           <w:sz w:val="20"/>
         </w:rPr>
-        <w:t xml:space="preserve">validateStudentData(data, </w:t>
+        <w:t>src</w:t>
       </w:r>
+      <w:proofErr w:type="spellEnd"/>
+      <w:r>
+        <w:rPr>
+          <w:rFonts w:ascii="Courier New" w:hAnsi="Courier New"/>
+          <w:sz w:val="20"/>
+        </w:rPr>
+        <w:t>/utils/validation.js</w:t>
+      </w:r>
+      <w:r>
+        <w:t xml:space="preserve"> providing dedicated validator functions for registration number, first name, last name, email, phone number, and password, as well as a composite </w:t>
+      </w:r>
+      <w:proofErr w:type="spellStart"/>
+      <w:r>
+        <w:rPr>
+          <w:rFonts w:ascii="Courier New" w:hAnsi="Courier New"/>
+          <w:sz w:val="20"/>
+        </w:rPr>
+        <w:t>validateStudentData</w:t>
+      </w:r>
+      <w:proofErr w:type="spellEnd"/>
+      <w:r>
+        <w:rPr>
+          <w:rFonts w:ascii="Courier New" w:hAnsi="Courier New"/>
+          <w:sz w:val="20"/>
+        </w:rPr>
+        <w:t xml:space="preserve">(data, </w:t>
+      </w:r>
+      <w:proofErr w:type="spellStart"/>
       <w:r>
         <w:rPr>
           <w:rFonts w:ascii="Courier New" w:hAnsi="Courier New"/>
           <w:sz w:val="20"/>
         </w:rPr>
         <w:lastRenderedPageBreak/>
-        <w:t>isEdit)</w:t>
+        <w:t>isEdit</w:t>
+      </w:r>
+      <w:proofErr w:type="spellEnd"/>
+      <w:r>
+        <w:rPr>
+          <w:rFonts w:ascii="Courier New" w:hAnsi="Courier New"/>
+          <w:sz w:val="20"/>
+        </w:rPr>
+        <w:t>)</w:t>
       </w:r>
       <w:r>
         <w:t xml:space="preserve"> function. Regular expressions enforce strict character whitelists and structural formats.</w:t>
@@ -995,21 +1267,47 @@
           <w:rFonts w:ascii="Courier New" w:hAnsi="Courier New"/>
           <w:sz w:val="20"/>
         </w:rPr>
-        <w:t>backend/src/controllers/studentController.js</w:t>
+        <w:t>backend/</w:t>
       </w:r>
-      <w:r>
-        <w:t xml:space="preserve">, </w:t>
-      </w:r>
+      <w:proofErr w:type="spellStart"/>
       <w:r>
         <w:rPr>
           <w:rFonts w:ascii="Courier New" w:hAnsi="Courier New"/>
           <w:sz w:val="20"/>
         </w:rPr>
-        <w:t>validateStudentData()</w:t>
+        <w:t>src</w:t>
+      </w:r>
+      <w:proofErr w:type="spellEnd"/>
+      <w:r>
+        <w:rPr>
+          <w:rFonts w:ascii="Courier New" w:hAnsi="Courier New"/>
+          <w:sz w:val="20"/>
+        </w:rPr>
+        <w:t>/controllers/studentController.js</w:t>
+      </w:r>
+      <w:r>
+        <w:t xml:space="preserve">, </w:t>
+      </w:r>
+      <w:proofErr w:type="spellStart"/>
+      <w:r>
+        <w:rPr>
+          <w:rFonts w:ascii="Courier New" w:hAnsi="Courier New"/>
+          <w:sz w:val="20"/>
+        </w:rPr>
+        <w:t>validateStudentData</w:t>
+      </w:r>
+      <w:proofErr w:type="spellEnd"/>
+      <w:r>
+        <w:rPr>
+          <w:rFonts w:ascii="Courier New" w:hAnsi="Courier New"/>
+          <w:sz w:val="20"/>
+        </w:rPr>
+        <w:t>()</w:t>
       </w:r>
       <w:r>
         <w:t xml:space="preserve"> is invoked at the very beginning of both </w:t>
       </w:r>
+      <w:proofErr w:type="spellStart"/>
       <w:r>
         <w:rPr>
           <w:rFonts w:ascii="Courier New" w:hAnsi="Courier New"/>
@@ -1017,9 +1315,11 @@
         </w:rPr>
         <w:t>addStudent</w:t>
       </w:r>
+      <w:proofErr w:type="spellEnd"/>
       <w:r>
         <w:t xml:space="preserve"> and </w:t>
       </w:r>
+      <w:proofErr w:type="spellStart"/>
       <w:r>
         <w:rPr>
           <w:rFonts w:ascii="Courier New" w:hAnsi="Courier New"/>
@@ -1027,6 +1327,7 @@
         </w:rPr>
         <w:t>editStudent</w:t>
       </w:r>
+      <w:proofErr w:type="spellEnd"/>
       <w:r>
         <w:t>. If validation fails, execution halts immediately and returns HTTP 400 Bad Request with a structured errors object.</w:t>
       </w:r>
@@ -1055,11 +1356,37 @@
           <w:rFonts w:ascii="Courier New" w:hAnsi="Courier New"/>
           <w:sz w:val="20"/>
         </w:rPr>
-        <w:t>frontend/src/components/StudentFormModal.jsx</w:t>
+        <w:t>frontend/</w:t>
       </w:r>
+      <w:proofErr w:type="spellStart"/>
+      <w:r>
+        <w:rPr>
+          <w:rFonts w:ascii="Courier New" w:hAnsi="Courier New"/>
+          <w:sz w:val="20"/>
+        </w:rPr>
+        <w:t>src</w:t>
+      </w:r>
+      <w:proofErr w:type="spellEnd"/>
+      <w:r>
+        <w:rPr>
+          <w:rFonts w:ascii="Courier New" w:hAnsi="Courier New"/>
+          <w:sz w:val="20"/>
+        </w:rPr>
+        <w:t>/components/</w:t>
+      </w:r>
+      <w:proofErr w:type="spellStart"/>
+      <w:r>
+        <w:rPr>
+          <w:rFonts w:ascii="Courier New" w:hAnsi="Courier New"/>
+          <w:sz w:val="20"/>
+        </w:rPr>
+        <w:t>StudentFormModal.jsx</w:t>
+      </w:r>
+      <w:proofErr w:type="spellEnd"/>
       <w:r>
         <w:t xml:space="preserve">, field-level validation mirrors the server-side rules. State hooks track </w:t>
       </w:r>
+      <w:proofErr w:type="spellStart"/>
       <w:r>
         <w:rPr>
           <w:rFonts w:ascii="Courier New" w:hAnsi="Courier New"/>
@@ -1067,6 +1394,7 @@
         </w:rPr>
         <w:t>fieldErrors</w:t>
       </w:r>
+      <w:proofErr w:type="spellEnd"/>
       <w:r>
         <w:t xml:space="preserve"> and </w:t>
       </w:r>
@@ -1151,7 +1479,15 @@
         <w:spacing w:after="80"/>
       </w:pPr>
       <w:r>
-        <w:t>Passwords continue to be securely hashed using bcryptjs before storage. Password validation is bypassed during student editing.</w:t>
+        <w:t xml:space="preserve">Passwords continue to be securely hashed using </w:t>
+      </w:r>
+      <w:proofErr w:type="spellStart"/>
+      <w:r>
+        <w:t>bcryptjs</w:t>
+      </w:r>
+      <w:proofErr w:type="spellEnd"/>
+      <w:r>
+        <w:t xml:space="preserve"> before storage. Password validation is bypassed during student editing.</w:t>
       </w:r>
     </w:p>
     <w:p>
@@ -1192,6 +1528,7 @@
       <w:r>
         <w:t xml:space="preserve">Edit and Delete operations continue to use the unique </w:t>
       </w:r>
+      <w:proofErr w:type="spellStart"/>
       <w:r>
         <w:rPr>
           <w:rFonts w:ascii="Courier New" w:hAnsi="Courier New"/>
@@ -1199,6 +1536,7 @@
         </w:rPr>
         <w:t>student.student_id</w:t>
       </w:r>
+      <w:proofErr w:type="spellEnd"/>
       <w:r>
         <w:t>.</w:t>
       </w:r>
@@ -1278,7 +1616,15 @@
         <w:spacing w:after="80"/>
       </w:pPr>
       <w:r>
-        <w:t>7. Backend controller receives request and immediately executes validateStudentData().</w:t>
+        <w:t xml:space="preserve">7. Backend controller receives request and immediately executes </w:t>
+      </w:r>
+      <w:proofErr w:type="spellStart"/>
+      <w:r>
+        <w:t>validateStudentData</w:t>
+      </w:r>
+      <w:proofErr w:type="spellEnd"/>
+      <w:r>
+        <w:t>().</w:t>
       </w:r>
     </w:p>
     <w:p>
@@ -3475,8 +3821,17 @@
                 <w:rFonts w:ascii="Calibri" w:hAnsi="Calibri"/>
                 <w:sz w:val="22"/>
               </w:rPr>
-              <w:t>Edit/Delete correct student using student_id</w:t>
-            </w:r>
+              <w:t xml:space="preserve">Edit/Delete correct student using </w:t>
+            </w:r>
+            <w:proofErr w:type="spellStart"/>
+            <w:r>
+              <w:rPr>
+                <w:rFonts w:ascii="Calibri" w:hAnsi="Calibri"/>
+                <w:sz w:val="22"/>
+              </w:rPr>
+              <w:t>student_id</w:t>
+            </w:r>
+            <w:proofErr w:type="spellEnd"/>
           </w:p>
         </w:tc>
         <w:tc>
@@ -3684,8 +4039,33 @@
                 <w:rFonts w:ascii="Calibri" w:hAnsi="Calibri"/>
                 <w:sz w:val="22"/>
               </w:rPr>
-              <w:t>POST /api/students/ with empty firstName</w:t>
-            </w:r>
+              <w:t>POST /</w:t>
+            </w:r>
+            <w:proofErr w:type="spellStart"/>
+            <w:r>
+              <w:rPr>
+                <w:rFonts w:ascii="Calibri" w:hAnsi="Calibri"/>
+                <w:sz w:val="22"/>
+              </w:rPr>
+              <w:t>api</w:t>
+            </w:r>
+            <w:proofErr w:type="spellEnd"/>
+            <w:r>
+              <w:rPr>
+                <w:rFonts w:ascii="Calibri" w:hAnsi="Calibri"/>
+                <w:sz w:val="22"/>
+              </w:rPr>
+              <w:t xml:space="preserve">/students/ with empty </w:t>
+            </w:r>
+            <w:proofErr w:type="spellStart"/>
+            <w:r>
+              <w:rPr>
+                <w:rFonts w:ascii="Calibri" w:hAnsi="Calibri"/>
+                <w:sz w:val="22"/>
+              </w:rPr>
+              <w:t>firstName</w:t>
+            </w:r>
+            <w:proofErr w:type="spellEnd"/>
           </w:p>
         </w:tc>
         <w:tc>
@@ -3771,7 +4151,39 @@
                 <w:rFonts w:ascii="Calibri" w:hAnsi="Calibri"/>
                 <w:sz w:val="22"/>
               </w:rPr>
-              <w:t>POST /api/students/ with firstName = "Jo" (&lt; 3 chars)</w:t>
+              <w:t>POST /</w:t>
+            </w:r>
+            <w:proofErr w:type="spellStart"/>
+            <w:r>
+              <w:rPr>
+                <w:rFonts w:ascii="Calibri" w:hAnsi="Calibri"/>
+                <w:sz w:val="22"/>
+              </w:rPr>
+              <w:t>api</w:t>
+            </w:r>
+            <w:proofErr w:type="spellEnd"/>
+            <w:r>
+              <w:rPr>
+                <w:rFonts w:ascii="Calibri" w:hAnsi="Calibri"/>
+                <w:sz w:val="22"/>
+              </w:rPr>
+              <w:t xml:space="preserve">/students/ with </w:t>
+            </w:r>
+            <w:proofErr w:type="spellStart"/>
+            <w:r>
+              <w:rPr>
+                <w:rFonts w:ascii="Calibri" w:hAnsi="Calibri"/>
+                <w:sz w:val="22"/>
+              </w:rPr>
+              <w:t>firstName</w:t>
+            </w:r>
+            <w:proofErr w:type="spellEnd"/>
+            <w:r>
+              <w:rPr>
+                <w:rFonts w:ascii="Calibri" w:hAnsi="Calibri"/>
+                <w:sz w:val="22"/>
+              </w:rPr>
+              <w:t xml:space="preserve"> = "Jo" (&lt; 3 chars)</w:t>
             </w:r>
           </w:p>
         </w:tc>
@@ -3788,7 +4200,23 @@
                 <w:rFonts w:ascii="Calibri" w:hAnsi="Calibri"/>
                 <w:sz w:val="22"/>
               </w:rPr>
-              <w:t>HTTP 400 with firstName error</w:t>
+              <w:t xml:space="preserve">HTTP 400 with </w:t>
+            </w:r>
+            <w:proofErr w:type="spellStart"/>
+            <w:r>
+              <w:rPr>
+                <w:rFonts w:ascii="Calibri" w:hAnsi="Calibri"/>
+                <w:sz w:val="22"/>
+              </w:rPr>
+              <w:t>firstName</w:t>
+            </w:r>
+            <w:proofErr w:type="spellEnd"/>
+            <w:r>
+              <w:rPr>
+                <w:rFonts w:ascii="Calibri" w:hAnsi="Calibri"/>
+                <w:sz w:val="22"/>
+              </w:rPr>
+              <w:t xml:space="preserve"> error</w:t>
             </w:r>
           </w:p>
         </w:tc>
@@ -3858,8 +4286,33 @@
                 <w:rFonts w:ascii="Calibri" w:hAnsi="Calibri"/>
                 <w:sz w:val="22"/>
               </w:rPr>
-              <w:t>POST /api/students/ with numeric firstName</w:t>
-            </w:r>
+              <w:t>POST /</w:t>
+            </w:r>
+            <w:proofErr w:type="spellStart"/>
+            <w:r>
+              <w:rPr>
+                <w:rFonts w:ascii="Calibri" w:hAnsi="Calibri"/>
+                <w:sz w:val="22"/>
+              </w:rPr>
+              <w:t>api</w:t>
+            </w:r>
+            <w:proofErr w:type="spellEnd"/>
+            <w:r>
+              <w:rPr>
+                <w:rFonts w:ascii="Calibri" w:hAnsi="Calibri"/>
+                <w:sz w:val="22"/>
+              </w:rPr>
+              <w:t xml:space="preserve">/students/ with numeric </w:t>
+            </w:r>
+            <w:proofErr w:type="spellStart"/>
+            <w:r>
+              <w:rPr>
+                <w:rFonts w:ascii="Calibri" w:hAnsi="Calibri"/>
+                <w:sz w:val="22"/>
+              </w:rPr>
+              <w:t>firstName</w:t>
+            </w:r>
+            <w:proofErr w:type="spellEnd"/>
           </w:p>
         </w:tc>
         <w:tc>
@@ -3875,7 +4328,23 @@
                 <w:rFonts w:ascii="Calibri" w:hAnsi="Calibri"/>
                 <w:sz w:val="22"/>
               </w:rPr>
-              <w:t>HTTP 400 with firstName error</w:t>
+              <w:t xml:space="preserve">HTTP 400 with </w:t>
+            </w:r>
+            <w:proofErr w:type="spellStart"/>
+            <w:r>
+              <w:rPr>
+                <w:rFonts w:ascii="Calibri" w:hAnsi="Calibri"/>
+                <w:sz w:val="22"/>
+              </w:rPr>
+              <w:t>firstName</w:t>
+            </w:r>
+            <w:proofErr w:type="spellEnd"/>
+            <w:r>
+              <w:rPr>
+                <w:rFonts w:ascii="Calibri" w:hAnsi="Calibri"/>
+                <w:sz w:val="22"/>
+              </w:rPr>
+              <w:t xml:space="preserve"> error</w:t>
             </w:r>
           </w:p>
         </w:tc>
@@ -3945,7 +4414,23 @@
                 <w:rFonts w:ascii="Calibri" w:hAnsi="Calibri"/>
                 <w:sz w:val="22"/>
               </w:rPr>
-              <w:t>POST /api/students/ with invalid email format</w:t>
+              <w:t>POST /</w:t>
+            </w:r>
+            <w:proofErr w:type="spellStart"/>
+            <w:r>
+              <w:rPr>
+                <w:rFonts w:ascii="Calibri" w:hAnsi="Calibri"/>
+                <w:sz w:val="22"/>
+              </w:rPr>
+              <w:t>api</w:t>
+            </w:r>
+            <w:proofErr w:type="spellEnd"/>
+            <w:r>
+              <w:rPr>
+                <w:rFonts w:ascii="Calibri" w:hAnsi="Calibri"/>
+                <w:sz w:val="22"/>
+              </w:rPr>
+              <w:t>/students/ with invalid email format</w:t>
             </w:r>
           </w:p>
         </w:tc>
@@ -4032,7 +4517,23 @@
                 <w:rFonts w:ascii="Calibri" w:hAnsi="Calibri"/>
                 <w:sz w:val="22"/>
               </w:rPr>
-              <w:t>POST /api/students/ with phone &lt; 10 digits</w:t>
+              <w:t>POST /</w:t>
+            </w:r>
+            <w:proofErr w:type="spellStart"/>
+            <w:r>
+              <w:rPr>
+                <w:rFonts w:ascii="Calibri" w:hAnsi="Calibri"/>
+                <w:sz w:val="22"/>
+              </w:rPr>
+              <w:t>api</w:t>
+            </w:r>
+            <w:proofErr w:type="spellEnd"/>
+            <w:r>
+              <w:rPr>
+                <w:rFonts w:ascii="Calibri" w:hAnsi="Calibri"/>
+                <w:sz w:val="22"/>
+              </w:rPr>
+              <w:t>/students/ with phone &lt; 10 digits</w:t>
             </w:r>
           </w:p>
         </w:tc>
@@ -4119,7 +4620,23 @@
                 <w:rFonts w:ascii="Calibri" w:hAnsi="Calibri"/>
                 <w:sz w:val="22"/>
               </w:rPr>
-              <w:t>POST /api/students/ with non-numeric phone</w:t>
+              <w:t>POST /</w:t>
+            </w:r>
+            <w:proofErr w:type="spellStart"/>
+            <w:r>
+              <w:rPr>
+                <w:rFonts w:ascii="Calibri" w:hAnsi="Calibri"/>
+                <w:sz w:val="22"/>
+              </w:rPr>
+              <w:t>api</w:t>
+            </w:r>
+            <w:proofErr w:type="spellEnd"/>
+            <w:r>
+              <w:rPr>
+                <w:rFonts w:ascii="Calibri" w:hAnsi="Calibri"/>
+                <w:sz w:val="22"/>
+              </w:rPr>
+              <w:t>/students/ with non-numeric phone</w:t>
             </w:r>
           </w:p>
         </w:tc>
@@ -4206,7 +4723,23 @@
                 <w:rFonts w:ascii="Calibri" w:hAnsi="Calibri"/>
                 <w:sz w:val="22"/>
               </w:rPr>
-              <w:t>POST /api/students/ with weak password</w:t>
+              <w:t>POST /</w:t>
+            </w:r>
+            <w:proofErr w:type="spellStart"/>
+            <w:r>
+              <w:rPr>
+                <w:rFonts w:ascii="Calibri" w:hAnsi="Calibri"/>
+                <w:sz w:val="22"/>
+              </w:rPr>
+              <w:t>api</w:t>
+            </w:r>
+            <w:proofErr w:type="spellEnd"/>
+            <w:r>
+              <w:rPr>
+                <w:rFonts w:ascii="Calibri" w:hAnsi="Calibri"/>
+                <w:sz w:val="22"/>
+              </w:rPr>
+              <w:t>/students/ with weak password</w:t>
             </w:r>
           </w:p>
         </w:tc>
@@ -4294,7 +4827,23 @@
                 <w:rFonts w:ascii="Calibri" w:hAnsi="Calibri"/>
                 <w:sz w:val="22"/>
               </w:rPr>
-              <w:t>POST /api/students/ with all valid data</w:t>
+              <w:t>POST /</w:t>
+            </w:r>
+            <w:proofErr w:type="spellStart"/>
+            <w:r>
+              <w:rPr>
+                <w:rFonts w:ascii="Calibri" w:hAnsi="Calibri"/>
+                <w:sz w:val="22"/>
+              </w:rPr>
+              <w:t>api</w:t>
+            </w:r>
+            <w:proofErr w:type="spellEnd"/>
+            <w:r>
+              <w:rPr>
+                <w:rFonts w:ascii="Calibri" w:hAnsi="Calibri"/>
+                <w:sz w:val="22"/>
+              </w:rPr>
+              <w:t>/students/ with all valid data</w:t>
             </w:r>
           </w:p>
         </w:tc>
@@ -4381,7 +4930,23 @@
                 <w:rFonts w:ascii="Calibri" w:hAnsi="Calibri"/>
                 <w:sz w:val="22"/>
               </w:rPr>
-              <w:t>PUT /api/students/:id with invalid email</w:t>
+              <w:t>PUT /</w:t>
+            </w:r>
+            <w:proofErr w:type="spellStart"/>
+            <w:r>
+              <w:rPr>
+                <w:rFonts w:ascii="Calibri" w:hAnsi="Calibri"/>
+                <w:sz w:val="22"/>
+              </w:rPr>
+              <w:t>api</w:t>
+            </w:r>
+            <w:proofErr w:type="spellEnd"/>
+            <w:r>
+              <w:rPr>
+                <w:rFonts w:ascii="Calibri" w:hAnsi="Calibri"/>
+                <w:sz w:val="22"/>
+              </w:rPr>
+              <w:t>/students/:id with invalid email</w:t>
             </w:r>
           </w:p>
         </w:tc>
@@ -4468,7 +5033,23 @@
                 <w:rFonts w:ascii="Calibri" w:hAnsi="Calibri"/>
                 <w:sz w:val="22"/>
               </w:rPr>
-              <w:t>PUT /api/students/:id with all valid data</w:t>
+              <w:t>PUT /</w:t>
+            </w:r>
+            <w:proofErr w:type="spellStart"/>
+            <w:r>
+              <w:rPr>
+                <w:rFonts w:ascii="Calibri" w:hAnsi="Calibri"/>
+                <w:sz w:val="22"/>
+              </w:rPr>
+              <w:t>api</w:t>
+            </w:r>
+            <w:proofErr w:type="spellEnd"/>
+            <w:r>
+              <w:rPr>
+                <w:rFonts w:ascii="Calibri" w:hAnsi="Calibri"/>
+                <w:sz w:val="22"/>
+              </w:rPr>
+              <w:t>/students/:id with all valid data</w:t>
             </w:r>
           </w:p>
         </w:tc>
@@ -7133,7 +7714,23 @@
         <w:spacing w:after="80"/>
       </w:pPr>
       <w:r>
-        <w:t>CR-004 was implemented as a comprehensive input validation enhancement for the Student Management System. Client-side inline validation provides immediate feedback to administrators on blur and change in StudentFormModal.jsx, ensuring that registration numbers, names, emails, phone numbers, and strong passwords adhere strictly to defined formats. Server-side validation in backend/src/utils/validation.js and studentController.js guarantees that direct API requests are verified and invalid data is rejected with HTTP 400 Bad Request. All 18 acceptance criteria were verified and passed, and existing student CRUD operations and administrative authorization remain completely functional.</w:t>
+        <w:t xml:space="preserve">CR-004 was implemented as a comprehensive input validation enhancement for the Student Management System. Client-side inline validation provides immediate feedback to administrators on blur and change in </w:t>
+      </w:r>
+      <w:proofErr w:type="spellStart"/>
+      <w:r>
+        <w:t>StudentFormModal.jsx</w:t>
+      </w:r>
+      <w:proofErr w:type="spellEnd"/>
+      <w:r>
+        <w:t>, ensuring that registration numbers, names, emails, phone numbers, and strong passwords adhere strictly to defined formats. Server-side validation in backend/</w:t>
+      </w:r>
+      <w:proofErr w:type="spellStart"/>
+      <w:r>
+        <w:t>src</w:t>
+      </w:r>
+      <w:proofErr w:type="spellEnd"/>
+      <w:r>
+        <w:t>/utils/validation.js and studentController.js guarantees that direct API requests are verified and invalid data is rejected with HTTP 400 Bad Request. All 18 acceptance criteria were verified and passed, and existing student CRUD operations and administrative authorization remain completely functional.</w:t>
       </w:r>
     </w:p>
     <w:p>

</xml_diff>